<commit_message>
Update official university-format syllabus docx: new course name (Language Models and Computerized Agents for Information Systems), course number 4261310, and session table rows 6/7/11/12 updated to match syllabus draft 3 (Agentic Coding + Git, new APIs/DB/Backend session, Architecture + Code Handoff, Deployment + Ethics). Added Geng et al. 2026 citation to bibliography.
</commit_message>
<xml_diff>
--- a/syllabus_university_format.docx
+++ b/syllabus_university_format.docx
@@ -123,7 +123,7 @@
           <w:sz w:val="22"/>
           <w:szCs w:val="22"/>
         </w:rPr>
-        <w:t>Vibe Coding – תכנות בסיוע בינה מלאכותית: עקרונות ותהליכי עבודה (AI-Assisted Software Development: Principles and Workflows)</w:t>
+        <w:t>מודלי שפה וסוכנים ממוחשבים למערכות מידע (Language Models and Computerized Agents for Information Systems)</w:t>
       </w:r>
     </w:p>
     <w:p>
@@ -150,7 +150,15 @@
           <w:szCs w:val="22"/>
           <w:rtl/>
         </w:rPr>
-        <w:t>:</w:t>
+        <w:t xml:space="preserve">: </w:t>
+      </w:r>
+      <w:r>
+        <w:rPr>
+          <w:rFonts w:ascii="David" w:eastAsia="David" w:hAnsi="David" w:cs="David"/>
+          <w:sz w:val="22"/>
+          <w:szCs w:val="22"/>
+        </w:rPr>
+        <w:t>4261310</w:t>
       </w:r>
     </w:p>
     <w:p>
@@ -317,7 +325,7 @@
           <w:sz w:val="22"/>
           <w:szCs w:val="22"/>
         </w:rPr>
-        <w:t>קורס זה מהווה שער לעולם התכנות בסיוע בינה מלאכותית (Vibe Coding), תוך התמקדות בשינוי המהותי שעברה עבודת הפיתוח מאז 2025: מעבר מכתיבת קוד שורה-שורה לניהול תהליך עבודה מול סוכני AI. המטרה היא לצייד את הסטודנטים בארגז כלים מעשי הכולל הנדסת פרומפטים (Prompt Engineering), הנדסת הקשר (Context Engineering), ועבודה עם סוכנים אוטונומיים (Agentic Coding), תוך שילוב מושכל של כלים אלה בתוך זרימת עבודה הנדסית אחראית — הכוללת בקרת גרסאות, בדיקות, סקירת קוד ואבטחת מידע.</w:t>
+        <w:t>קורס זה מהווה שער לעולם התכנות בסיוע בינה מלאכותית (Vibe Coding), תוך התמקדות בשינוי המהותי שעברה עבודת הפיתוח מאז 2025: מעבר מכתיבת קוד שורה-שורה לניהול תהליך עבודה מול סוכני AI. המטרה היא לצייד את הסטודנטים בארגז כלים מעשי הכולל הנדסת פרומפטים (Prompt Engineering), הנדסת הקשר (Context Engineering), ועבודה עם סוכנים אוטונומיים (Agentic Coding), תוך שילוב מושכל של כלים אלה בתוך זרימת עבודה הנדסית אחראית — הכוללת בקרת גרסאות, בדיקות, סקירת קוד, אבטחת מידע, עבודה מול ממשקי API ובסיסי נתונים, עקרונות ארכיטקטורה, ופריסת מערכות לסביבת ייצור (deployment).</w:t>
       </w:r>
     </w:p>
     <w:p>
@@ -913,7 +921,7 @@
               <w:rPr>
                 <w:rFonts w:ascii="David" w:eastAsia="David" w:hAnsi="David" w:cs="David"/>
               </w:rPr>
-              <w:t>מפרומפט לסוכן פועל</w:t>
+              <w:t>מפרומפט לפעולה מפוקחת</w:t>
             </w:r>
           </w:p>
         </w:tc>
@@ -936,7 +944,7 @@
               <w:rPr>
                 <w:rFonts w:ascii="David" w:eastAsia="David" w:hAnsi="David" w:cs="David"/>
               </w:rPr>
-              <w:t>תכנות אג'נטי (Agentic Coding): לולאת plan-act-observe, שימוש בכלים (Tool Use), ורמות אוטונומיה.</w:t>
+              <w:t>תכנות אג'נטי (Agentic Coding) ובקרת גרסאות: לולאת plan-act-observe, שימוש בכלים (Tool Use) ורמות אוטונומיה; יסודות Git מאפס (commit, branch, merge), ו-code review בעזרת AI.</w:t>
             </w:r>
           </w:p>
         </w:tc>
@@ -990,7 +998,7 @@
               <w:rPr>
                 <w:rFonts w:ascii="David" w:eastAsia="David" w:hAnsi="David" w:cs="David"/>
               </w:rPr>
-              <w:t>תיעוד ואחריות בעבודת צוות</w:t>
+              <w:t>מקוד לשירות חי</w:t>
             </w:r>
           </w:p>
         </w:tc>
@@ -1013,7 +1021,7 @@
               <w:rPr>
                 <w:rFonts w:ascii="David" w:eastAsia="David" w:hAnsi="David" w:cs="David"/>
               </w:rPr>
-              <w:t>Git ובקרת גרסאות בעולם ה-AI: מסרי commit משמעותיים, וסקירת קוד (Code Review) בעזרת AI.</w:t>
+              <w:t>APIs, בסיסי נתונים ו-Backend עם AI: עבודה מול ממשק API חיצוני, יסודות SQL וסכמת נתונים בעזרת AI, ומבוא ל-spec-driven development.</w:t>
             </w:r>
           </w:p>
         </w:tc>
@@ -1298,7 +1306,7 @@
               <w:rPr>
                 <w:rFonts w:ascii="David" w:eastAsia="David" w:hAnsi="David" w:cs="David"/>
               </w:rPr>
-              <w:t>מפרויקט צעצוע לקוד אמיתי</w:t>
+              <w:t>מקוד עובד לקוד נכון</w:t>
             </w:r>
           </w:p>
         </w:tc>
@@ -1321,7 +1329,7 @@
               <w:rPr>
                 <w:rFonts w:ascii="David" w:eastAsia="David" w:hAnsi="David" w:cs="David"/>
               </w:rPr>
-              <w:t>עבודה על בסיסי קוד קיימים: Refactoring בעזרת AI, וחיבור ליכולות מורחבות באמצעות MCP.</w:t>
+              <w:t>ארכיטקטורה, קוד-בייס גדול ו-Code Handoff: Refactoring בעזרת AI, עקרונות מעבר ל"זה עובד" (תחזוקתיות, עיצוב API, קנה-מידה), וקליטת קוד-בייס שכתב גורם אחר.</w:t>
             </w:r>
           </w:p>
         </w:tc>
@@ -1376,7 +1384,7 @@
                 <w:rFonts w:ascii="David" w:eastAsia="David" w:hAnsi="David" w:cs="David"/>
               </w:rPr>
               <w:lastRenderedPageBreak/>
-              <w:t>גבולות האחריות האנושית</w:t>
+              <w:t>מהקוד לעולם האמיתי</w:t>
             </w:r>
           </w:p>
         </w:tc>
@@ -1399,7 +1407,7 @@
               <w:rPr>
                 <w:rFonts w:ascii="David" w:eastAsia="David" w:hAnsi="David" w:cs="David"/>
               </w:rPr>
-              <w:t>אתיקה, משפט וארגון: זכויות יוצרים על קוד שנוצר ב-AI, ומדיניות שימוש ארגונית.</w:t>
+              <w:t>Deployment, אתיקה ומשפט: פריסת פרויקט לסביבה חיה וצ'קליסט לפני חשיפה, זכויות יוצרים על קוד AI ומדיניות שימוש ארגונית.</w:t>
             </w:r>
           </w:p>
         </w:tc>
@@ -1814,6 +1822,25 @@
           <w:szCs w:val="22"/>
         </w:rPr>
         <w:t>Fowler, M. (2018). Refactoring: Improving the Design of Existing Code (2nd ed.). Addison-Wesley.</w:t>
+      </w:r>
+    </w:p>
+    <w:p>
+      <w:pPr>
+        <w:pStyle w:val="ListParagraph"/>
+        <w:numPr>
+          <w:ilvl w:val="0"/>
+          <w:numId w:val="1"/>
+        </w:numPr>
+        <w:bidi/>
+        <w:spacing w:after="60"/>
+      </w:pPr>
+      <w:r>
+        <w:rPr>
+          <w:rFonts w:ascii="David" w:eastAsia="David" w:hAnsi="David" w:cs="David"/>
+          <w:sz w:val="22"/>
+          <w:szCs w:val="22"/>
+        </w:rPr>
+        <w:t>Geng, F. et al. (2026). Mapping the Emerging Curriculum for AI-Assisted Software Engineering via Syllabus Analysis. arXiv:2608.05898.</w:t>
       </w:r>
     </w:p>
     <w:p>

</xml_diff>